<commit_message>
fix(contract-template): add Jinja2 placeholders and context fields for last page sign table
</commit_message>
<xml_diff>
--- a/backend/templates/contracts/安全生产社会化服务_template.docx
+++ b/backend/templates/contracts/安全生产社会化服务_template.docx
@@ -2910,30 +2910,8 @@
             </w:tcBorders>
           </w:tcPr>
           <w:p>
-            <w:pPr>
-              <w:pStyle w:val="10"/>
-              <w:spacing w:before="2"/>
-              <w:rPr>
-                <w:rFonts w:ascii="Times New Roman"/>
-                <w:sz w:val="26"/>
-              </w:rPr>
-            </w:pPr>
-          </w:p>
-          <w:p>
-            <w:pPr>
-              <w:pStyle w:val="10"/>
-              <w:spacing w:before="1"/>
-              <w:ind w:right="33"/>
-              <w:jc w:val="right"/>
-              <w:rPr>
-                <w:sz w:val="21"/>
-              </w:rPr>
-            </w:pPr>
-            <w:r>
-              <w:rPr>
-                <w:sz w:val="21"/>
-              </w:rPr>
-              <w:t>（盖章）</w:t>
+            <w:r>
+              <w:t>{{party_a_name}}</w:t>
             </w:r>
           </w:p>
         </w:tc>
@@ -3026,29 +3004,8 @@
             </w:tcBorders>
           </w:tcPr>
           <w:p>
-            <w:pPr>
-              <w:pStyle w:val="10"/>
-              <w:spacing w:before="1"/>
-              <w:rPr>
-                <w:rFonts w:ascii="Times New Roman"/>
-                <w:sz w:val="27"/>
-              </w:rPr>
-            </w:pPr>
-          </w:p>
-          <w:p>
-            <w:pPr>
-              <w:pStyle w:val="10"/>
-              <w:ind w:right="80"/>
-              <w:jc w:val="right"/>
-              <w:rPr>
-                <w:sz w:val="21"/>
-              </w:rPr>
-            </w:pPr>
-            <w:r>
-              <w:rPr>
-                <w:sz w:val="21"/>
-              </w:rPr>
-              <w:t>（签章）</w:t>
+            <w:r>
+              <w:t>{{party_a_legal_rep}}</w:t>
             </w:r>
           </w:p>
         </w:tc>
@@ -3211,28 +3168,8 @@
             </w:tcBorders>
           </w:tcPr>
           <w:p>
-            <w:pPr>
-              <w:pStyle w:val="10"/>
-              <w:rPr>
-                <w:rFonts w:ascii="Times New Roman"/>
-                <w:sz w:val="27"/>
-              </w:rPr>
-            </w:pPr>
-          </w:p>
-          <w:p>
-            <w:pPr>
-              <w:pStyle w:val="10"/>
-              <w:ind w:right="69"/>
-              <w:jc w:val="right"/>
-              <w:rPr>
-                <w:sz w:val="21"/>
-              </w:rPr>
-            </w:pPr>
-            <w:r>
-              <w:rPr>
-                <w:sz w:val="21"/>
-              </w:rPr>
-              <w:t>（签章）</w:t>
+            <w:r>
+              <w:t>{{party_a_contact_name}}</w:t>
             </w:r>
           </w:p>
         </w:tc>
@@ -3324,13 +3261,9 @@
             </w:tcBorders>
           </w:tcPr>
           <w:p>
-            <w:pPr>
-              <w:pStyle w:val="10"/>
-              <w:rPr>
-                <w:rFonts w:ascii="Times New Roman"/>
-                <w:sz w:val="20"/>
-              </w:rPr>
-            </w:pPr>
+            <w:r>
+              <w:t>{{party_a_address}}</w:t>
+            </w:r>
           </w:p>
         </w:tc>
       </w:tr>
@@ -3437,13 +3370,9 @@
             </w:tcBorders>
           </w:tcPr>
           <w:p>
-            <w:pPr>
-              <w:pStyle w:val="10"/>
-              <w:rPr>
-                <w:rFonts w:ascii="Times New Roman"/>
-                <w:sz w:val="20"/>
-              </w:rPr>
-            </w:pPr>
+            <w:r>
+              <w:t>{{party_a_phone}}</w:t>
+            </w:r>
           </w:p>
         </w:tc>
         <w:tc>
@@ -3507,13 +3436,9 @@
             </w:tcBorders>
           </w:tcPr>
           <w:p>
-            <w:pPr>
-              <w:pStyle w:val="10"/>
-              <w:rPr>
-                <w:rFonts w:ascii="Times New Roman"/>
-                <w:sz w:val="20"/>
-              </w:rPr>
-            </w:pPr>
+            <w:r>
+              <w:t>{{party_a_fax}}</w:t>
+            </w:r>
           </w:p>
         </w:tc>
       </w:tr>
@@ -3604,13 +3529,9 @@
             </w:tcBorders>
           </w:tcPr>
           <w:p>
-            <w:pPr>
-              <w:pStyle w:val="10"/>
-              <w:rPr>
-                <w:rFonts w:ascii="Times New Roman"/>
-                <w:sz w:val="20"/>
-              </w:rPr>
-            </w:pPr>
+            <w:r>
+              <w:t>{{party_a_bank}}</w:t>
+            </w:r>
           </w:p>
         </w:tc>
       </w:tr>
@@ -3717,13 +3638,9 @@
             </w:tcBorders>
           </w:tcPr>
           <w:p>
-            <w:pPr>
-              <w:pStyle w:val="10"/>
-              <w:rPr>
-                <w:rFonts w:ascii="Times New Roman"/>
-                <w:sz w:val="20"/>
-              </w:rPr>
-            </w:pPr>
+            <w:r>
+              <w:t>{{party_a_account}}</w:t>
+            </w:r>
           </w:p>
         </w:tc>
         <w:tc>
@@ -3787,13 +3704,9 @@
             </w:tcBorders>
           </w:tcPr>
           <w:p>
-            <w:pPr>
-              <w:pStyle w:val="10"/>
-              <w:rPr>
-                <w:rFonts w:ascii="Times New Roman"/>
-                <w:sz w:val="20"/>
-              </w:rPr>
-            </w:pPr>
+            <w:r>
+              <w:t>{{party_a_tax_no}}</w:t>
+            </w:r>
           </w:p>
         </w:tc>
       </w:tr>
@@ -4083,48 +3996,8 @@
             <w:vAlign w:val="center"/>
           </w:tcPr>
           <w:p>
-            <w:pPr>
-              <w:pStyle w:val="10"/>
-              <w:spacing w:before="20"/>
-              <w:jc w:val="center"/>
-              <w:rPr>
-                <w:rFonts w:hint="eastAsia" w:ascii="宋体" w:hAnsi="宋体" w:eastAsia="宋体" w:cs="宋体"/>
-                <w:sz w:val="9"/>
-              </w:rPr>
-            </w:pPr>
-          </w:p>
-          <w:p>
-            <w:pPr>
-              <w:pStyle w:val="10"/>
-              <w:ind w:left="1166" w:leftChars="0" w:right="0" w:rightChars="0"/>
-              <w:jc w:val="left"/>
-              <w:rPr>
-                <w:sz w:val="21"/>
-              </w:rPr>
-            </w:pPr>
-            <w:r>
-              <w:rPr>
-                <w:rFonts w:hint="eastAsia" w:ascii="宋体" w:hAnsi="宋体" w:eastAsia="宋体" w:cs="宋体"/>
-                <w:sz w:val="21"/>
-                <w:lang w:val="en-US" w:eastAsia="zh-CN"/>
-              </w:rPr>
-              <w:t>杭州</w:t>
-            </w:r>
-            <w:r>
-              <w:rPr>
-                <w:rFonts w:hint="eastAsia" w:cs="宋体"/>
-                <w:sz w:val="21"/>
-                <w:lang w:val="en-US" w:eastAsia="zh-CN"/>
-              </w:rPr>
-              <w:t>承益</w:t>
-            </w:r>
-            <w:r>
-              <w:rPr>
-                <w:rFonts w:hint="eastAsia" w:ascii="宋体" w:hAnsi="宋体" w:eastAsia="宋体" w:cs="宋体"/>
-                <w:sz w:val="21"/>
-                <w:lang w:val="en-US" w:eastAsia="zh-CN"/>
-              </w:rPr>
-              <w:t>安全科技有限公司</w:t>
+            <w:r>
+              <w:t>{{party_b_name}}</w:t>
             </w:r>
           </w:p>
         </w:tc>
@@ -4217,42 +4090,8 @@
             <w:vAlign w:val="center"/>
           </w:tcPr>
           <w:p>
-            <w:pPr>
-              <w:pStyle w:val="10"/>
-              <w:spacing w:before="9"/>
-              <w:jc w:val="center"/>
-              <w:rPr>
-                <w:rFonts w:hint="eastAsia" w:ascii="宋体" w:hAnsi="宋体" w:eastAsia="宋体" w:cs="宋体"/>
-                <w:sz w:val="9"/>
-              </w:rPr>
-            </w:pPr>
-          </w:p>
-          <w:p>
-            <w:pPr>
-              <w:pStyle w:val="10"/>
-              <w:tabs>
-                <w:tab w:val="left" w:pos="1673"/>
-              </w:tabs>
-              <w:ind w:right="-29" w:rightChars="0" w:firstLine="420" w:firstLineChars="200"/>
-              <w:jc w:val="both"/>
-              <w:rPr>
-                <w:sz w:val="21"/>
-              </w:rPr>
-            </w:pPr>
-            <w:r>
-              <w:rPr>
-                <w:rFonts w:hint="eastAsia" w:cs="宋体"/>
-                <w:sz w:val="21"/>
-                <w:lang w:val="en-US" w:eastAsia="zh-CN"/>
-              </w:rPr>
-              <w:t xml:space="preserve">沈琳莉 </w:t>
-            </w:r>
-            <w:r>
-              <w:rPr>
-                <w:rFonts w:hint="eastAsia" w:ascii="宋体" w:hAnsi="宋体" w:eastAsia="宋体" w:cs="宋体"/>
-                <w:sz w:val="21"/>
-              </w:rPr>
-              <w:t>（签章）</w:t>
+            <w:r>
+              <w:t>{{party_b_legal_rep}}</w:t>
             </w:r>
           </w:p>
         </w:tc>
@@ -4419,25 +4258,9 @@
             <w:vAlign w:val="center"/>
           </w:tcPr>
           <w:p>
-            <w:pPr>
-              <w:pStyle w:val="10"/>
-              <w:spacing w:before="10"/>
-              <w:jc w:val="right"/>
-              <w:rPr>
-                <w:rFonts w:hint="eastAsia" w:ascii="宋体" w:hAnsi="宋体" w:eastAsia="宋体" w:cs="宋体"/>
-                <w:sz w:val="9"/>
-              </w:rPr>
-            </w:pPr>
-          </w:p>
-          <w:p>
-            <w:pPr>
-              <w:pStyle w:val="10"/>
-              <w:ind w:left="0" w:leftChars="0" w:right="69" w:rightChars="0"/>
-              <w:jc w:val="right"/>
-              <w:rPr>
-                <w:sz w:val="21"/>
-              </w:rPr>
-            </w:pPr>
+            <w:r>
+              <w:t>{{party_b_project_manager}}</w:t>
+            </w:r>
           </w:p>
         </w:tc>
       </w:tr>
@@ -4529,53 +4352,9 @@
             <w:vAlign w:val="center"/>
           </w:tcPr>
           <w:p>
-            <w:pPr>
-              <w:pStyle w:val="10"/>
-              <w:spacing w:before="10"/>
-              <w:jc w:val="center"/>
-              <w:rPr>
-                <w:rFonts w:hint="eastAsia" w:ascii="宋体" w:hAnsi="宋体" w:eastAsia="宋体" w:cs="宋体"/>
-                <w:sz w:val="9"/>
-              </w:rPr>
-            </w:pPr>
-          </w:p>
-          <w:p>
-            <w:pPr>
-              <w:pStyle w:val="10"/>
-              <w:ind w:left="636" w:leftChars="0" w:right="0" w:rightChars="0"/>
-              <w:jc w:val="left"/>
-              <w:rPr>
-                <w:rFonts w:hint="default"/>
-                <w:sz w:val="21"/>
-                <w:lang w:val="en-US"/>
-              </w:rPr>
-            </w:pPr>
-            <w:r>
-              <w:rPr>
-                <w:rFonts w:hint="eastAsia" w:ascii="宋体" w:hAnsi="宋体" w:eastAsia="宋体" w:cs="宋体"/>
-                <w:sz w:val="21"/>
-                <w:lang w:eastAsia="zh-CN"/>
-              </w:rPr>
-              <w:t>杭州市余杭区</w:t>
-            </w:r>
-            <w:r>
-              <w:rPr>
-                <w:rFonts w:hint="eastAsia" w:ascii="宋体" w:hAnsi="宋体" w:eastAsia="宋体" w:cs="宋体"/>
-                <w:sz w:val="21"/>
-                <w:lang w:val="en-US" w:eastAsia="zh-CN"/>
-              </w:rPr>
-              <w:t>瓶窑镇</w:t>
-            </w:r>
-            <w:r>
-              <w:rPr>
-                <w:rFonts w:hint="eastAsia" w:cs="宋体"/>
-                <w:sz w:val="21"/>
-                <w:lang w:val="en-US" w:eastAsia="zh-CN"/>
-              </w:rPr>
-              <w:t>国辅路9号内2幢201-202室</w:t>
-            </w:r>
-            <w:bookmarkStart w:id="0" w:name="_GoBack"/>
-            <w:bookmarkEnd w:id="0"/>
+            <w:r>
+              <w:t>{{party_b_address}}</w:t>
+            </w:r>
           </w:p>
         </w:tc>
       </w:tr>
@@ -4667,34 +4446,8 @@
             <w:vAlign w:val="center"/>
           </w:tcPr>
           <w:p>
-            <w:pPr>
-              <w:pStyle w:val="10"/>
-              <w:spacing w:before="18"/>
-              <w:jc w:val="left"/>
-              <w:rPr>
-                <w:rFonts w:hint="eastAsia" w:ascii="宋体" w:hAnsi="宋体" w:eastAsia="宋体" w:cs="宋体"/>
-                <w:sz w:val="14"/>
-              </w:rPr>
-            </w:pPr>
-          </w:p>
-          <w:p>
-            <w:pPr>
-              <w:pStyle w:val="10"/>
-              <w:spacing w:before="1"/>
-              <w:ind w:left="708" w:leftChars="0" w:right="0" w:rightChars="0"/>
-              <w:jc w:val="left"/>
-              <w:rPr>
-                <w:rFonts w:ascii="Times New Roman"/>
-                <w:sz w:val="21"/>
-              </w:rPr>
-            </w:pPr>
-            <w:r>
-              <w:rPr>
-                <w:rFonts w:hint="eastAsia" w:cs="宋体"/>
-                <w:sz w:val="21"/>
-                <w:lang w:val="en-US" w:eastAsia="zh-CN"/>
-              </w:rPr>
-              <w:t xml:space="preserve"> </w:t>
+            <w:r>
+              <w:t>{{party_b_phone}}</w:t>
             </w:r>
           </w:p>
         </w:tc>
@@ -4767,35 +4520,8 @@
             <w:vAlign w:val="center"/>
           </w:tcPr>
           <w:p>
-            <w:pPr>
-              <w:pStyle w:val="10"/>
-              <w:spacing w:before="18"/>
-              <w:jc w:val="left"/>
-              <w:rPr>
-                <w:rFonts w:hint="eastAsia" w:ascii="宋体" w:hAnsi="宋体" w:eastAsia="宋体" w:cs="宋体"/>
-                <w:sz w:val="14"/>
-              </w:rPr>
-            </w:pPr>
-          </w:p>
-          <w:p>
-            <w:pPr>
-              <w:pStyle w:val="10"/>
-              <w:spacing w:before="1"/>
-              <w:ind w:left="118" w:leftChars="0" w:right="0" w:rightChars="0"/>
-              <w:jc w:val="left"/>
-              <w:rPr>
-                <w:rFonts w:hint="default" w:ascii="Times New Roman"/>
-                <w:sz w:val="21"/>
-                <w:lang w:val="en-US"/>
-              </w:rPr>
-            </w:pPr>
-            <w:r>
-              <w:rPr>
-                <w:rFonts w:hint="eastAsia" w:cs="宋体"/>
-                <w:sz w:val="21"/>
-                <w:lang w:val="en-US" w:eastAsia="zh-CN"/>
-              </w:rPr>
-              <w:t xml:space="preserve"> 15888839287</w:t>
+            <w:r>
+              <w:t>{{party_b_mobile}}</w:t>
             </w:r>
           </w:p>
         </w:tc>
@@ -4888,47 +4614,8 @@
             <w:vAlign w:val="center"/>
           </w:tcPr>
           <w:p>
-            <w:pPr>
-              <w:pStyle w:val="10"/>
-              <w:spacing w:before="10"/>
-              <w:jc w:val="center"/>
-              <w:rPr>
-                <w:rFonts w:hint="eastAsia" w:ascii="宋体" w:hAnsi="宋体" w:eastAsia="宋体" w:cs="宋体"/>
-                <w:sz w:val="9"/>
-              </w:rPr>
-            </w:pPr>
-          </w:p>
-          <w:p>
-            <w:pPr>
-              <w:pStyle w:val="10"/>
-              <w:ind w:left="326" w:leftChars="0" w:right="0" w:rightChars="0"/>
-              <w:jc w:val="left"/>
-              <w:rPr>
-                <w:sz w:val="21"/>
-              </w:rPr>
-            </w:pPr>
-            <w:r>
-              <w:rPr>
-                <w:rFonts w:hint="eastAsia" w:ascii="宋体" w:hAnsi="宋体" w:eastAsia="宋体" w:cs="宋体"/>
-                <w:sz w:val="21"/>
-                <w:lang w:eastAsia="zh-CN"/>
-              </w:rPr>
-              <w:t>浙江杭州</w:t>
-            </w:r>
-            <w:r>
-              <w:rPr>
-                <w:rFonts w:hint="eastAsia" w:ascii="宋体" w:hAnsi="宋体" w:eastAsia="宋体" w:cs="宋体"/>
-                <w:sz w:val="21"/>
-              </w:rPr>
-              <w:t>余杭农村商业银行</w:t>
-            </w:r>
-            <w:r>
-              <w:rPr>
-                <w:rFonts w:hint="eastAsia" w:ascii="宋体" w:hAnsi="宋体" w:eastAsia="宋体" w:cs="宋体"/>
-                <w:sz w:val="21"/>
-                <w:lang w:eastAsia="zh-CN"/>
-              </w:rPr>
-              <w:t>股份有限公司余杭支行</w:t>
+            <w:r>
+              <w:t>{{party_b_bank}}</w:t>
             </w:r>
           </w:p>
         </w:tc>
@@ -5034,34 +4721,8 @@
             <w:vAlign w:val="center"/>
           </w:tcPr>
           <w:p>
-            <w:pPr>
-              <w:pStyle w:val="10"/>
-              <w:spacing w:before="18"/>
-              <w:jc w:val="center"/>
-              <w:rPr>
-                <w:rFonts w:hint="eastAsia" w:ascii="宋体" w:hAnsi="宋体" w:eastAsia="宋体" w:cs="宋体"/>
-                <w:sz w:val="14"/>
-              </w:rPr>
-            </w:pPr>
-          </w:p>
-          <w:p>
-            <w:pPr>
-              <w:pStyle w:val="10"/>
-              <w:spacing w:before="1"/>
-              <w:ind w:left="585" w:leftChars="0" w:right="0" w:rightChars="0"/>
-              <w:jc w:val="center"/>
-              <w:rPr>
-                <w:rFonts w:ascii="Times New Roman"/>
-                <w:sz w:val="21"/>
-              </w:rPr>
-            </w:pPr>
-            <w:r>
-              <w:rPr>
-                <w:rFonts w:hint="eastAsia" w:ascii="宋体" w:hAnsi="宋体" w:eastAsia="宋体" w:cs="宋体"/>
-                <w:sz w:val="21"/>
-                <w:lang w:val="en-US" w:eastAsia="zh-CN"/>
-              </w:rPr>
-              <w:t>201000261749218</w:t>
+            <w:r>
+              <w:t>{{party_b_account}}</w:t>
             </w:r>
           </w:p>
         </w:tc>
@@ -5132,36 +4793,8 @@
             <w:vAlign w:val="center"/>
           </w:tcPr>
           <w:p>
-            <w:pPr>
-              <w:pStyle w:val="10"/>
-              <w:spacing w:before="1"/>
-              <w:ind w:right="632" w:firstLine="210" w:firstLineChars="100"/>
-              <w:jc w:val="center"/>
-              <w:rPr>
-                <w:rFonts w:hint="eastAsia" w:ascii="宋体" w:hAnsi="宋体" w:eastAsia="宋体" w:cs="宋体"/>
-                <w:sz w:val="21"/>
-                <w:lang w:val="en-US" w:eastAsia="zh-CN"/>
-              </w:rPr>
-            </w:pPr>
-          </w:p>
-          <w:p>
-            <w:pPr>
-              <w:pStyle w:val="10"/>
-              <w:spacing w:before="1"/>
-              <w:ind w:left="0" w:leftChars="0" w:right="632" w:rightChars="0" w:firstLine="210" w:firstLineChars="100"/>
-              <w:jc w:val="center"/>
-              <w:rPr>
-                <w:rFonts w:ascii="Times New Roman"/>
-                <w:sz w:val="21"/>
-              </w:rPr>
-            </w:pPr>
-            <w:r>
-              <w:rPr>
-                <w:rFonts w:hint="eastAsia" w:ascii="宋体" w:hAnsi="宋体" w:eastAsia="宋体" w:cs="宋体"/>
-                <w:sz w:val="21"/>
-                <w:lang w:val="en-US" w:eastAsia="zh-CN"/>
-              </w:rPr>
-              <w:t>402331003097</w:t>
+            <w:r>
+              <w:t>{{party_b_bank_code}}</w:t>
             </w:r>
           </w:p>
         </w:tc>

</xml_diff>